<commit_message>
Update masters: org size 30,000, Scrum Master certification, typo fixes
Co-Authored-By: Claude Sonnet 5.5 <noreply@anthropic.com>
Claude-Session: https://claude.ai/code/session_01VZRhBcbgVPAMaxZJYqHoWB
</commit_message>
<xml_diff>
--- a/job-search/Matthew-Weinhoffer_Resume_2026_MASTER.docx
+++ b/job-search/Matthew-Weinhoffer_Resume_2026_MASTER.docx
@@ -790,7 +790,7 @@
           <w:rtl w:val="0"/>
           <w:lang w:val="en-US"/>
         </w:rPr>
-        <w:t xml:space="preserve">perations and AI implementation leader with a track record of transforming manual, fragmented workflows into streamlined, automated and systems. At BAYADA, rebuilt how a 40-person marketing division operates </w:t>
+        <w:t xml:space="preserve">perations and AI implementation leader with a track record of transforming manual, fragmented workflows into streamlined, automated systems. At BAYADA, rebuilt how a 40-person marketing division operates </w:t>
       </w:r>
       <w:r>
         <w:rPr>
@@ -1078,7 +1078,7 @@
           <w:rtl w:val="0"/>
           <w:lang w:val="en-US"/>
         </w:rPr>
-        <w:t>, Power Automate, Teamwork.com, Smartsheet, Asana, Basecamp, Jira, Trello, Figma, Box, Dropbox, Make.com, Sigma Computing, Zapier, Make.com</w:t>
+        <w:t>, Power Automate, Teamwork.com, Smartsheet, Asana, Basecamp, Jira, Trello, Figma, Box, Dropbox, Make.com, Sigma Computing, Zapier</w:t>
       </w:r>
     </w:p>
     <w:p>
@@ -1302,6 +1302,83 @@
           <w:lang w:val="en-US"/>
         </w:rPr>
         <w:t>functional communications and meeting cadences, SOP development and refinement, change management, staff training, lean process redesign</w:t>
+      </w:r>
+    </w:p>
+    <w:p>
+      <w:pPr>
+        <w:pStyle w:val="Body A"/>
+        <w:tabs>
+          <w:tab w:val="left" w:pos="720"/>
+          <w:tab w:val="left" w:pos="1440"/>
+          <w:tab w:val="left" w:pos="2160"/>
+          <w:tab w:val="left" w:pos="2880"/>
+          <w:tab w:val="left" w:pos="3600"/>
+          <w:tab w:val="left" w:pos="4320"/>
+          <w:tab w:val="left" w:pos="5040"/>
+          <w:tab w:val="left" w:pos="5760"/>
+          <w:tab w:val="left" w:pos="6480"/>
+          <w:tab w:val="left" w:pos="7200"/>
+          <w:tab w:val="left" w:pos="7920"/>
+          <w:tab w:val="left" w:pos="8640"/>
+          <w:tab w:val="left" w:pos="9292"/>
+        </w:tabs>
+        <w:rPr>
+          <w:rFonts w:ascii="Helvetica" w:cs="Helvetica" w:hAnsi="Helvetica" w:eastAsia="Helvetica"/>
+          <w:b w:val="1"/>
+          <w:bCs w:val="1"/>
+          <w:sz w:val="18"/>
+          <w:szCs w:val="18"/>
+          <w:u w:color="1a1a2e"/>
+        </w:rPr>
+      </w:pPr>
+      <w:r>
+        <w:rPr>
+          <w:rFonts w:ascii="Helvetica" w:hAnsi="Helvetica"/>
+          <w:b w:val="1"/>
+          <w:bCs w:val="1"/>
+          <w:sz w:val="18"/>
+          <w:szCs w:val="18"/>
+          <w:rtl w:val="0"/>
+          <w:lang w:val="en-US"/>
+        </w:rPr>
+        <w:t xml:space="preserve">Certification: </w:t>
+      </w:r>
+    </w:p>
+    <w:p>
+      <w:pPr>
+        <w:pStyle w:val="Body A"/>
+        <w:tabs>
+          <w:tab w:val="left" w:pos="720"/>
+          <w:tab w:val="left" w:pos="1440"/>
+          <w:tab w:val="left" w:pos="2160"/>
+          <w:tab w:val="left" w:pos="2880"/>
+          <w:tab w:val="left" w:pos="3600"/>
+          <w:tab w:val="left" w:pos="4320"/>
+          <w:tab w:val="left" w:pos="5040"/>
+          <w:tab w:val="left" w:pos="5760"/>
+          <w:tab w:val="left" w:pos="6480"/>
+          <w:tab w:val="left" w:pos="7200"/>
+          <w:tab w:val="left" w:pos="7920"/>
+          <w:tab w:val="left" w:pos="8640"/>
+          <w:tab w:val="left" w:pos="9292"/>
+        </w:tabs>
+        <w:ind w:left="567" w:firstLine="0"/>
+        <w:rPr>
+          <w:rFonts w:ascii="Helvetica" w:cs="Helvetica" w:hAnsi="Helvetica" w:eastAsia="Helvetica"/>
+          <w:sz w:val="18"/>
+          <w:szCs w:val="18"/>
+        </w:rPr>
+      </w:pPr>
+      <w:r>
+        <w:rPr>
+          <w:rFonts w:ascii="Helvetica" w:hAnsi="Helvetica"/>
+          <w:sz w:val="18"/>
+          <w:szCs w:val="18"/>
+          <w:u w:color="111111"/>
+          <w:rtl w:val="0"/>
+          <w:lang w:val="en-US"/>
+        </w:rPr>
+        <w:t>Scrum Master Certification — Six Sigma Global Institute</w:t>
       </w:r>
     </w:p>
     <w:p>
@@ -1658,7 +1735,7 @@
           <w:rtl w:val="0"/>
           <w:lang w:val="en-US"/>
         </w:rPr>
-        <w:t>BAYADA is one of the largest home health care organizations in the US, with approximately 300,000 employees served by a 40-person marketing division, who is served by a one-person Marketing Operations team.</w:t>
+        <w:t>BAYADA is one of the largest home health care organizations in the US, with approximately 30,000 employees served by a 40-person marketing division, who is served by a one-person Marketing Operations team.</w:t>
       </w:r>
     </w:p>
     <w:p>
@@ -1962,7 +2039,7 @@
           <w:rtl w:val="0"/>
           <w:lang w:val="en-US"/>
         </w:rPr>
-        <w:t>Restructured the Design on Demand (DoD) freelance program by replacing low-priority design requests with an AI-driven process, effectively scaling design capacity across a 300,000-person organization without adding headcount</w:t>
+        <w:t>Restructured the Design on Demand (DoD) freelance program by replacing low-priority design requests with an AI-driven process, effectively scaling design capacity across a 30,000-person organization without adding headcount</w:t>
       </w:r>
     </w:p>
     <w:p>

</xml_diff>

<commit_message>
Update masters: Bachelor's degree, Workfront
Co-Authored-By: Claude Sonnet 5.5 <noreply@anthropic.com>
Claude-Session: https://claude.ai/code/session_01VZRhBcbgVPAMaxZJYqHoWB
</commit_message>
<xml_diff>
--- a/job-search/Matthew-Weinhoffer_Resume_2026_MASTER.docx
+++ b/job-search/Matthew-Weinhoffer_Resume_2026_MASTER.docx
@@ -1078,7 +1078,7 @@
           <w:rtl w:val="0"/>
           <w:lang w:val="en-US"/>
         </w:rPr>
-        <w:t>, Power Automate, Teamwork.com, Smartsheet, Asana, Basecamp, Jira, Trello, Figma, Box, Dropbox, Make.com, Sigma Computing, Zapier</w:t>
+        <w:t>, Power Automate, Teamwork.com, Smartsheet, Asana, Workfront, Basecamp, Jira, Trello, Figma, Box, Dropbox, Make.com, Sigma Computing, Zapier</w:t>
       </w:r>
     </w:p>
     <w:p>
@@ -5741,7 +5741,7 @@
           <w:rtl w:val="0"/>
           <w:lang w:val="en-US"/>
         </w:rPr>
-        <w:t xml:space="preserve">University Student </w:t>
+        <w:t xml:space="preserve">Bachelor's Degree </w:t>
       </w:r>
       <w:r>
         <w:rPr>

</xml_diff>